<commit_message>
Final manuscript pass: abstract within 250 words, overflowing tables fixed, highlights and cover letter updated
- Abstract rewritten to 243 words (Applied Soft Computing limit 250), with the
  narrowed cohort A claim.
- tab:repr, tab:noise and tab:ratecurve scaled to the column; tab:repr was
  overprinting the neighbouring column.
- Related work no longer says the rate constraint is shown to be two-sided;
  contribution 5 states the measured cohort B cost; one banned word removed.
- \pending is a no-op; PENDING_NUMBERS.md removed (no red remains).
- highlights.docx/pdf regenerated from the manuscript (tools/make_highlights.py);
  cover letter rewritten with current numbers.
- Audit 125/125 (three checks of removed abstract wording retired; the same
  numbers remain checked in the body). Compiled with MiKTeX, 22 pages.

Co-Authored-By: Claude Opus 5 (1M context) <noreply@anthropic.com>
</commit_message>
<xml_diff>
--- a/paper/highlights.docx
+++ b/paper/highlights.docx
@@ -4,23 +4,16 @@
   <w:body>
     <w:p>
       <w:pPr>
-        <w:spacing w:after="240"/>
+        <w:pStyle w:val="Heading1"/>
       </w:pPr>
       <w:r>
-        <w:rPr>
-          <w:b/>
-          <w:sz w:val="26"/>
-        </w:rPr>
         <w:t>Highlights</w:t>
       </w:r>
     </w:p>
     <w:p>
-      <w:pPr>
-        <w:spacing w:after="280"/>
-      </w:pPr>
       <w:r>
         <w:rPr>
-          <w:i/>
+          <w:b/>
         </w:rPr>
         <w:t>Label-free covariance alignment for longitudinal EEG decoding</w:t>
       </w:r>
@@ -28,25 +21,30 @@
     <w:p>
       <w:pPr>
         <w:pStyle w:val="ListBullet"/>
-        <w:spacing w:after="160"/>
       </w:pPr>
       <w:r>
-        <w:t>A 24,181-parameter EEG decoder emitting class and calibrated confidence.</w:t>
+        <w:t>A 24,181-parameter EEG decoder with label-free alignment that adapts at test time.</w:t>
       </w:r>
     </w:p>
     <w:p>
       <w:pPr>
         <w:pStyle w:val="ListBullet"/>
-        <w:spacing w:after="160"/>
       </w:pPr>
       <w:r>
-        <w:t>Label-free in-network alignment reduces session drift by 52–84% in 15 of 15 subjects.</w:t>
+        <w:t>Accuracy is level with eight published decoders trained in the same pipeline.</w:t>
       </w:r>
     </w:p>
     <w:p>
       <w:pPr>
         <w:pStyle w:val="ListBullet"/>
-        <w:spacing w:after="160"/>
+      </w:pPr>
+      <w:r>
+        <w:t>In-network alignment reduces session drift by 46–63% in 15 of 15 subjects.</w:t>
+      </w:r>
+    </w:p>
+    <w:p>
+      <w:pPr>
+        <w:pStyle w:val="ListBullet"/>
       </w:pPr>
       <w:r>
         <w:t>Test-time adaptation can track the streaming class and erase the signal it protects.</w:t>
@@ -55,24 +53,14 @@
     <w:p>
       <w:pPr>
         <w:pStyle w:val="ListBullet"/>
-        <w:spacing w:after="160"/>
       </w:pPr>
       <w:r>
-        <w:t>Two cohorts have opposite adaptation-rate optima, costing 0.06–0.09 to get wrong.</w:t>
-      </w:r>
-    </w:p>
-    <w:p>
-      <w:pPr>
-        <w:pStyle w:val="ListBullet"/>
-        <w:spacing w:after="160"/>
-      </w:pPr>
-      <w:r>
-        <w:t>The admissible rate band is computable from the recording protocol before fitting.</w:t>
+        <w:t>A lower bound on adaptation rate, read from the protocol, predicted a new cohort.</w:t>
       </w:r>
     </w:p>
     <w:sectPr>
       <w:pgSz w:w="12240" w:h="15840"/>
-      <w:pgMar w:top="1440" w:right="1584" w:bottom="1440" w:left="1584" w:header="720" w:footer="720" w:gutter="0"/>
+      <w:pgMar w:top="1440" w:right="1800" w:bottom="1440" w:left="1800" w:header="720" w:footer="720" w:gutter="0"/>
       <w:cols w:space="720"/>
       <w:docGrid w:linePitch="360"/>
     </w:sectPr>
@@ -445,7 +433,7 @@
     <w:rsid w:val="00FC693F"/>
     <w:rPr>
       <w:rFonts w:ascii="Times New Roman" w:hAnsi="Times New Roman"/>
-      <w:sz w:val="22"/>
+      <w:sz w:val="24"/>
     </w:rPr>
   </w:style>
   <w:style w:type="paragraph" w:styleId="Header">

</xml_diff>